<commit_message>
Fixed RaggieSoft Media Header
</commit_message>
<xml_diff>
--- a/_workspace/books/casey/casey.docx
+++ b/_workspace/books/casey/casey.docx
@@ -2399,7 +2399,7 @@
     </w:p>
     <w:p>
       <w:r>
-        <w:t>Liz just shook her head in quiet awe. Cass efficiently guided us through the NPU portal, helping us set up our student accounts and walking us through the application forms. When it came to the permanent residence section, she dictated her Federal Way apartment address for both of us, officially locking in our new West Coast perimeter. As soon as the forms were complete, Cass pulled a sleek corporate card from her wallet and paid both application fees directly over the secure connection.</w:t>
+        <w:t>Liz just shook her head in quiet awe. Cass efficiently guided us through the NPU portal, helping us set up our student accounts and walking us through the application forms. When it came to the permanent residence section, she dictated her Federal Way apartment address for both of us, officially locking in our new West Coast perimeter. As soon as the forms were complete, Cass pulled a sleek card from her wallet and paid both application fees directly over the secure connection.</w:t>
       </w:r>
     </w:p>
     <w:p>
@@ -5859,215 +5859,853 @@
         <w:pStyle w:val="Heading3"/>
       </w:pPr>
       <w:r>
-        <w:t>Part 5: The Route 230 Protocol – 12:15 PM</w:t>
-      </w:r>
-    </w:p>
-    <w:p>
-      <w:r>
-        <w:t>By noon, the Redmond campus was buzzing with an electric, celebratory energy. The global email had deployed, and the "Courtyard CEO" was officially the successor.</w:t>
-      </w:r>
-    </w:p>
-    <w:p>
-      <w:r>
-        <w:t>Inside the Building 33 executive suite, the Head of Corporate Security, a man named Henderson, was actively trying to execute his newly assigned mandate. He trailed closely behind Cassandra as she wheeled out of her corner office, flanked by two highly stressed executive fixers.</w:t>
-      </w:r>
-    </w:p>
-    <w:p>
-      <w:r>
-        <w:t>"Ms. Vance, the press pool has completely surrounded the main visitor entrance," Henderson warned, checking his earpiece. "I have two armored SUVs waiting in the subterranean executive garage. We can slip you out under the radar. Your house is only three blocks away; we can have you home and secure in under two minutes."</w:t>
-      </w:r>
-    </w:p>
-    <w:p>
-      <w:r>
-        <w:t>"I am not sneaking out of my own building in an armored tank, Henderson," Cassandra replied smoothly, her Quantum laptop bag resting securely on her lap. "Besides, I'm not going home just yet. And officially, I am not the CEO until Steve retires on February 14th. Today, I am just celebrating."</w:t>
-      </w:r>
-    </w:p>
-    <w:p>
-      <w:r>
-        <w:t>"Then let us drive you to your celebration!" one of the fixers pleaded, stepping in front of her chair. "Where are you going? Bellevue? We can have the motorcade spool up—"</w:t>
-      </w:r>
-    </w:p>
-    <w:p>
-      <w:r>
-        <w:t>"I already told the dispatch to stand down," Cassandra interrupted politely but firmly, wheeling smoothly around him. "Good afternoon, gentlemen. I am taking the bus."</w:t>
-      </w:r>
-    </w:p>
-    <w:p>
-      <w:r>
-        <w:t>She left the horrified security director and the fixers standing speechless in the executive corridor.</w:t>
-      </w:r>
-    </w:p>
-    <w:p>
-      <w:r>
-        <w:t>Leaving Building 33, Cassandra could have easily taken the short, paved roll back to her sprawling Redmond property to celebrate with David, Liz, and Casey. But today, she had a specific errand in mind.</w:t>
-      </w:r>
-    </w:p>
-    <w:p>
-      <w:r>
-        <w:t>She wheeled herself across the crisp, sunlit campus, navigating the wide sidewalks toward Building 16. The moment she entered the building's massive cafeteria to grab a quick bite to eat, a spontaneous round of applause broke out among the developers and staff eating their lunches. Cassandra smiled, waving and stopping to shake a few hands, picking up a standard deli sandwich and a sparkling water before continuing her trek.</w:t>
-      </w:r>
-    </w:p>
-    <w:p>
-      <w:r>
-        <w:t>She rolled through the campus pathways, enjoying the crisp winter air, until she emerged on the eastern edge of the campus near Building 25.</w:t>
-      </w:r>
-    </w:p>
-    <w:p>
-      <w:r>
-        <w:t>She rolled right up to the curb of 156th Avenue NE and locked her brakes at the municipal transit shelter.</w:t>
-      </w:r>
-    </w:p>
-    <w:p>
-      <w:r>
-        <w:t>A breathless fixer, who had apparently jogged all the way across campus from Building 33, came huffing up to the bus stop. "Ms. Vance! Please! If you absolutely insist on taking public transit to the Downtown Bellevue offices, at least let me walk you up to the Overlake Transit Center so you can catch the TAPS Express 564 or 565!"</w:t>
-      </w:r>
-    </w:p>
-    <w:p>
-      <w:r>
-        <w:t>Cassandra took a bite of her sandwich, looking at the exhausted handler with a mixture of amusement and pity.</w:t>
-      </w:r>
-    </w:p>
-    <w:p>
-      <w:r>
-        <w:t>"I don't want the express route today," Cassandra explained calmly. "I want to see the neighborhood."</w:t>
-      </w:r>
-    </w:p>
-    <w:p>
-      <w:r>
-        <w:t>"But the local route takes forever!" the fixer groaned, looking at the schedule posted on the glass shelter.</w:t>
-      </w:r>
-    </w:p>
-    <w:p>
-      <w:r>
-        <w:t>"Which gives me plenty of time to eat my lunch," Cassandra smiled.</w:t>
-      </w:r>
-    </w:p>
-    <w:p>
-      <w:r>
-        <w:t>A few minutes later, the heavy, articulated TAPS King County Route 230 bus hissed to a halt at the curb. The doors opened, and the driver immediately hit the switch to lower the mechanical ramp.</w:t>
-      </w:r>
-    </w:p>
-    <w:p>
-      <w:r>
-        <w:t>"Afternoon, Cassandra!" the driver called out cheerfully, entirely accustomed to the nice lady in the wheelchair who knew the transit grid better than the dispatchers. "Heard the good news on the radio! Congratulations!"</w:t>
-      </w:r>
-    </w:p>
-    <w:p>
-      <w:r>
-        <w:t>"Thank you, Marcus," Cassandra smiled warmly, rolling up the incline.</w:t>
-      </w:r>
-    </w:p>
-    <w:p>
-      <w:r>
-        <w:t>She tapped her blue TAPS Pass against the digital reader, leaving the bewildered corporate handler standing on the sidewalk. She maneuvered her manual chair into the designated ADA bay, locked her brakes, and watched out the window as the 230 began its route.</w:t>
-      </w:r>
-    </w:p>
-    <w:p>
-      <w:r>
-        <w:t>It was the ultimate, defiant contrast to the Silicon Valley billionaire stereotype. The entire financial world was currently obsessing over her historic ascension, and her very first executive decision as the CEO-designate was to take the local bus.</w:t>
-      </w:r>
-    </w:p>
-    <w:p>
-      <w:r>
-        <w:t>The Route 230 crawled down 156th Avenue NE, offering her a slow, nostalgic view of the sprawling Redmond suburbs before it finally signaled its right turn onto NE 8th Street. As the bus carried her straight into the towering, glass-and-steel heart of Downtown Bellevue, Cassandra felt a profound sense of closure.</w:t>
-      </w:r>
-    </w:p>
-    <w:p>
-      <w:r>
-        <w:t>When the bus finally dropped her off at the Bellevue Transit Center, she didn't head toward a high-end restaurant or a press junket. She wheeled herself toward the older Quantum office towers. She was going to see the original mid-level managers and legacy developers who had given a nineteen-year-old disabled girl her very first shot in the summer of 2000.</w:t>
-      </w:r>
-    </w:p>
-    <w:p>
-      <w:r>
-        <w:t>She was about to run the empire, but she was never going to forget the people who helped her build the foundation.</w:t>
-      </w:r>
-    </w:p>
-    <w:p>
-      <w:pPr>
-        <w:pStyle w:val="Heading3"/>
-      </w:pPr>
-      <w:r>
-        <w:t>Part 6: The Bellevue Reunion – 1:30 PM</w:t>
-      </w:r>
-    </w:p>
-    <w:p>
-      <w:r>
-        <w:t>When Cassandra Vance rolled into the twelfth-floor bullpen of Quantum's Downtown Bellevue tower, the entire floor came to a complete, stunned halt.</w:t>
-      </w:r>
-    </w:p>
-    <w:p>
-      <w:r>
-        <w:t>The legacy managers and veteran senior developers—the exact same people who had taken a chance on a nineteen-year-old disabled girl fresh out of physical rehab back in the summer of 2000—stared at her in absolute disbelief. They had all read the global email broadcast that morning. They knew that she had just been unanimously tapped to inherit the trillion-dollar tech empire. They simply couldn't believe that instead of celebrating with Wall Street elites or popping champagne in the Building 33 vault, she had taken a local city bus to come see them.</w:t>
-      </w:r>
-    </w:p>
-    <w:p>
-      <w:r>
-        <w:t>"You really did it, Cass," an older, gray-haired database architect laughed, walking over to wrap her in a warm, familiar hug. "They actually gave you the keys to the machine."</w:t>
-      </w:r>
-    </w:p>
-    <w:p>
-      <w:r>
-        <w:t>"I only know how the machine works because you all taught me how to read the blueprints," Cassandra smiled warmly, returning the embrace.</w:t>
-      </w:r>
-    </w:p>
-    <w:p>
-      <w:r>
-        <w:t>For the next twenty minutes, the bullpen was a chorus of joyous celebration. Cassandra shook hands, caught up on old deployment war stories, and genuinely basked in the unvarnished affection of the people who had formed her original corporate perimeter.</w:t>
-      </w:r>
-    </w:p>
-    <w:p>
-      <w:r>
-        <w:t>But true to her nature, Cassandra Vance never stayed entirely off the clock for long.</w:t>
-      </w:r>
-    </w:p>
-    <w:p>
-      <w:r>
-        <w:t xml:space="preserve">When the initial wave of congratulations naturally settled, Cassandra didn't head back to the elevators. Instead, she navigated her manual chair toward the open-plan communal workspace overlooking the Bellevue skyline. With a quick mechanical snap, her piano-black Quantum laptop locked into the specialized, commercial-grade articulated mounting arm outfitted on her chair. </w:t>
-      </w:r>
-    </w:p>
-    <w:p>
-      <w:r>
-        <w:t>She noticed a cluster of new, entry-level junior developers hovering nervously near the breakroom. They were clutching their laptops, staring at her with wide eyes. To them, she wasn't the nostalgic kid from the year 2000; she was the newly minted CEO-designate of the most powerful software corporation on earth.</w:t>
-      </w:r>
-    </w:p>
-    <w:p>
-      <w:r>
-        <w:t>Cassandra offered them a sharp, welcoming smile and patted the empty communal table next to her chair.</w:t>
-      </w:r>
-    </w:p>
-    <w:p>
-      <w:r>
-        <w:t>"Don't just stand there analyzing the optics," Cassandra called out, her voice projecting a smooth, pragmatic ease. "Grab a seat. Let's look at what you're working on."</w:t>
-      </w:r>
-    </w:p>
-    <w:p>
-      <w:r>
-        <w:t>The junior developers hesitantly shuffled over, pulling out chairs. As they sat down, Cassandra decided to explicitly establish the operational baseline for her new era of leadership. She reached into her laptop bag and pulled out a pair of heavy, noise-canceling headphones, resting them flat on the table.</w:t>
-      </w:r>
-    </w:p>
-    <w:p>
-      <w:r>
-        <w:t xml:space="preserve">"Let's establish the ground rules right now," Cassandra announced, ensuring her voice carried across the communal space. "When you see me set up in a workspace, the protocol is simple. If these heavy headphones are over my ears, I am tearing apart a deployment schedule or running an executive audit, and I cannot be interrupted. But if my headphones are resting on the table—like they are right now—the perimeter is entirely open. You do not need an appointment, you do not need an executive assistant, and you do not need to be a manager to speak to me." </w:t>
-      </w:r>
-    </w:p>
-    <w:p>
-      <w:r>
-        <w:t>She looked around the table at the young, intimidated faces, completely dropping the veil of corporate omniscience.</w:t>
-      </w:r>
-    </w:p>
-    <w:p>
-      <w:r>
-        <w:t xml:space="preserve">"I am officially taking over this company next month, but I am only in my thirties," Cassandra explained, leaning forward on her armrests. "My foundational coding habits were built a decade ago. Technology moves significantly faster than the C-suite. You are the ones actively learning the newest frameworks and the bleeding-edge syntax in your university labs. I know how this machine currently runs, but I want to know how it </w:t>
+        <w:t>Part 5: The Shadow Wallet – 11:12 AM</w:t>
+      </w:r>
+    </w:p>
+    <w:p>
+      <w:r>
+        <w:t>David Vance sat at his dedicated, comfortable desk positioned out of the direct line of corporate traffic in the corner of the executive suite. As Cassandra's Licensed Practical Nurse, his sole metric for success was her medical stability. He kept a silent medical overwatch, his eyes flicking between her micro-expressions and the real-time EKG data streaming to his tablet via a highly secure, built-in GPS and cellular uplink.</w:t>
+      </w:r>
+    </w:p>
+    <w:p>
+      <w:r>
+        <w:t>Right now, his fingers were tapping a rapid, rigid rhythm against his leather medical kit—a stimming pattern signaling that his autistic bandwidth was fraying. Steve Ballantine had been in the middle of a crucial, highly structured conversation about the transition of executive power, and David despised unpredictable environmental disruptions.</w:t>
+      </w:r>
+    </w:p>
+    <w:p>
+      <w:r>
+        <w:t>The heavy glass doors clicked open. Cassandra’s executive assistant looked flustered, stepping aside for a man in a sharply tailored charcoal suit carrying a lacquered wooden box and a brushed-aluminum attaché case.</w:t>
+      </w:r>
+    </w:p>
+    <w:p>
+      <w:r>
+        <w:t>"I apologize, Ms. Vance," her assistant said, tight-lipped. "He refused to leave this with the desk. Said it was signatory only."</w:t>
+      </w:r>
+    </w:p>
+    <w:p>
+      <w:r>
+        <w:t>David shifted defensively in his chair, his hand resting near the refrigerated case holding his emergency subcutaneous biologic injections. Despite wearing the bright Orange Badge of a temporary contractor, every employee in Building 33 knew David operated completely outside the corporate hierarchy. He would physically intercept an ambitious executive—or a rogue courier—without a second thought to protect his sister's baseline.</w:t>
+      </w:r>
+    </w:p>
+    <w:p>
+      <w:r>
+        <w:t>The man in the suit didn't look like a standard courier. He was a bonded Private Wealth Associate. He stepped forward, bypassed Steve entirely, and set the heavy box directly on Cassandra’s desk. With a quiet click, he opened it.</w:t>
+      </w:r>
+    </w:p>
+    <w:p>
+      <w:r>
+        <w:t xml:space="preserve">Inside, resting on black velvet, was a heavy, anodized black titanium card. </w:t>
       </w:r>
       <w:r>
         <w:rPr>
           <w:i/>
           <w:iCs/>
         </w:rPr>
-        <w:t>should</w:t>
-      </w:r>
-      <w:r>
-        <w:t xml:space="preserve"> run."</w:t>
+        <w:t>Cassandra Vance</w:t>
+      </w:r>
+      <w:r>
+        <w:t xml:space="preserve"> was elegantly laser-etched into the cold metal. Beneath the card was a single, heavy-stock sheet of paper and an uncapped, silver-barreled fountain pen.</w:t>
+      </w:r>
+    </w:p>
+    <w:p>
+      <w:r>
+        <w:t>Cassandra frowned, her analytical mind immediately calculating the timeline. "The SEC filings hit the wire seven minutes ago. There is physically no way you etched a titanium card and drove it from Bellevue to Redmond in seven minutes."</w:t>
+      </w:r>
+    </w:p>
+    <w:p>
+      <w:r>
+        <w:t xml:space="preserve">Steve Ballantine let out a booming, echoing laugh that filled the corner office. "They didn't drive it from Bellevue, Cass. They’ve been sitting out in the surface lot off 159th Ave NE all morning waiting for the 8-K to drop." He glanced toward the window, which overlooked the campus footprint. "Meridian knows you don't use the executive </w:t>
+      </w:r>
+      <w:proofErr w:type="spellStart"/>
+      <w:r>
+        <w:t>motorpool</w:t>
+      </w:r>
+      <w:proofErr w:type="spellEnd"/>
+      <w:r>
+        <w:t>, so they staged their associate right at the visitor entrance. I guess William's old airport parking spot down in the lower-level garage is officially going to sit empty now since you take the bus everywhere." He looked at the associate with deep, amused respect. "Who else did you have etched in the trunk? Richardson? Miller?"</w:t>
+      </w:r>
+    </w:p>
+    <w:p>
+      <w:r>
+        <w:t>The associate offered a perfectly neutral, diplomatic smile, neither confirming nor denying the corporate espionage.</w:t>
+      </w:r>
+    </w:p>
+    <w:p>
+      <w:r>
+        <w:t>"Meridian Heritage Bank," the associate said smoothly, turning his attention back to Cassandra. "Ms. Vance, congratulations on the appointment. The card in that box is currently a dormant piece of titanium. Federal law prevents us from sending you an active account unprompted. I am here to serve as the bonded witness to your wet-ink signature. Once you sign that single sheet of paper formally requesting the account, I will execute a secure cryptographic ping to our servers. The card will be live with an eight-figure shadow limit before I reach the lobby elevator."</w:t>
+      </w:r>
+    </w:p>
+    <w:p>
+      <w:r>
+        <w:t>Cassandra picked up the card. It weighed fifteen grams—cold to the touch and undeniably substantial. "I don't bank with Meridian. And I already have a Quantum corporate card for my travel." She maintained rigid control over her financial logistics, banking exclusively with the Quantum Employees Federal Credit Union and only utilizing her credit card for absolute necessities, like checking into a hotel.</w:t>
+      </w:r>
+    </w:p>
+    <w:p>
+      <w:r>
+        <w:t xml:space="preserve">"Which is audited," Steve countered instantly, his tone turning serious. He reached into the inner pocket of his own suit jacket and produced an identical, black titanium Meridian Obsidian Card, tossing it onto the mahogany desk so it landed with a heavy, authoritative </w:t>
+      </w:r>
+      <w:r>
+        <w:rPr>
+          <w:i/>
+          <w:iCs/>
+        </w:rPr>
+        <w:t>clack</w:t>
+      </w:r>
+      <w:r>
+        <w:t>.</w:t>
+      </w:r>
+    </w:p>
+    <w:p>
+      <w:r>
+        <w:t>Steve glanced at the Meridian associate. Recognizing the cue, the associate took two precise steps backward, clasping his hands behind his back and adopting the impenetrable, absolute deafness required of ultra-luxury hospitality. He became a ghost in the room.</w:t>
+      </w:r>
+    </w:p>
+    <w:p>
+      <w:r>
+        <w:t>Steve placed both hands on her desk. "Sign it, Cass. Right now."</w:t>
+      </w:r>
+    </w:p>
+    <w:p>
+      <w:r>
+        <w:t>"Steve, I don't need another line of credit."</w:t>
+      </w:r>
+    </w:p>
+    <w:p>
+      <w:r>
+        <w:t>"You don't need the credit, you need the wall," Steve explained, tapping the titanium card. "From today on, every single dollar you spend on a Quantum corporate card is going to be scrutinized by the board, the SEC, and the press. You have no privacy left. But that? That is a shadow wallet. It doesn't touch the company. It doesn't touch your public filings."</w:t>
+      </w:r>
+    </w:p>
+    <w:p>
+      <w:r>
+        <w:t>Cassandra turned the cold metal over in her hand, staring at the embedded EMV chip.</w:t>
+      </w:r>
+    </w:p>
+    <w:p>
+      <w:r>
+        <w:t>"Meridian is waiving the initiation and the annual fees because they want the bragging rights at Davos that the CEO of Quantum runs her private life through them," Steve continued, his voice dropping into a register of quiet, mentoring truth. "In exchange, you get the Meridian Global Desk. If you need to quietly charter a twin-engine commercial helicopter to the North Cascades because an avalanche wiped out State Route 20—or if you need to buy a private medical clinic in cash for your brother without a single reporter finding out—you use the Obsidian Card. It keeps your family completely off the corporate grid."</w:t>
+      </w:r>
+    </w:p>
+    <w:p>
+      <w:r>
+        <w:t>Cassandra looked at the heavy-stock Private Wealth Proposal. She thought of Johnny’s strict medical baseline, the sovereign isolation of Ruby Mountain, and the absolute necessity of keeping her bloodline insulated from her new public reality.</w:t>
+      </w:r>
+    </w:p>
+    <w:p>
+      <w:r>
+        <w:t>She picked up the silver-barreled fountain pen and signed her name with a sharp, aggressive flourish.</w:t>
+      </w:r>
+    </w:p>
+    <w:p>
+      <w:r>
+        <w:t xml:space="preserve">The associate stepped forward instantly. With white-glove precision, he retrieved the heavy-stock paper, slid it into a tamper-evident secure folio, and locked it inside his aluminum attaché case. He then produced a heavily encrypted corporate </w:t>
+      </w:r>
+      <w:r>
+        <w:t>device</w:t>
+      </w:r>
+      <w:r>
+        <w:t xml:space="preserve"> from his breast pocket. He typed a rapid, twelve-character command and waited exactly three seconds.</w:t>
+      </w:r>
+    </w:p>
+    <w:p>
+      <w:r>
+        <w:t>A soft, vibrating confirmation hummed from the device.</w:t>
+      </w:r>
+    </w:p>
+    <w:p>
+      <w:r>
+        <w:t>"The cryptographic handshake is complete. The shadow limit is live," the associate announced, offering a crisp, deferential bow. "Welcome to the Meridian Global Desk, Ms. Vance."</w:t>
+      </w:r>
+    </w:p>
+    <w:p>
+      <w:pPr>
+        <w:pStyle w:val="Heading3"/>
+      </w:pPr>
+      <w:r>
+        <w:t>Part 6: The Global Desk – 11:20 AM</w:t>
+      </w:r>
+    </w:p>
+    <w:p>
+      <w:r>
+        <w:t>Cassandra looked at the heavy black metal in her hand. To her highly pragmatic mind, it was just a charge card. A tool for transactions. She slipped it out of its velvet presentation box and turned to her docked Quantum laptop.</w:t>
+      </w:r>
+    </w:p>
+    <w:p>
+      <w:r>
+        <w:t>She had a promise to fulfill. She had scheduled Friday through Monday off for a pack deployment down to Portland to visit the zoo, returning to Building 33 on Tuesday. She pulled up the Columbia Transit Service (CTS) website. It was time to load the transit fares.</w:t>
+      </w:r>
+    </w:p>
+    <w:p>
+      <w:r>
+        <w:t xml:space="preserve">She typed in the Obsidian Card's number, navigating the notoriously clunky CTS portal. She had to process four entirely separate twenty-dollar transactions: one to refill her accessible Honored Citizen RosePass, and three more for the standard RosePasses belonging to David, Liz, and Casey. </w:t>
+      </w:r>
+    </w:p>
+    <w:p>
+      <w:r>
+        <w:rPr>
+          <w:i/>
+          <w:iCs/>
+        </w:rPr>
+        <w:t>Click. Click. Click. Click.</w:t>
+      </w:r>
+    </w:p>
+    <w:p>
+      <w:r>
+        <w:t>"Done," Cassandra murmured, sliding the card onto her desk. "It's just another card."</w:t>
+      </w:r>
+    </w:p>
+    <w:p>
+      <w:r>
+        <w:t>Steve Ballantine smiled, leaning his hip against the edge of her mahogany desk. "It is infinitely more than that, Cass. I told you, you get the Meridian Global Desk."</w:t>
+      </w:r>
+    </w:p>
+    <w:p>
+      <w:r>
+        <w:t>Cassandra looked up, adjusting her glasses.</w:t>
+      </w:r>
+    </w:p>
+    <w:p>
+      <w:r>
+        <w:t xml:space="preserve">"They fix things," Steve explained, his voice dropping into a quiet, serious register. "If you need to charter a helicopter in the dead of winter to get your family off of Ruby Mountain, they do it". </w:t>
+      </w:r>
+    </w:p>
+    <w:p>
+      <w:r>
+        <w:t>In the corner of the room, David suddenly stopped tapping his medical kit. He looked up, his sharp, analytical eyes locking onto the outgoing CEO with sudden, intense interest.</w:t>
+      </w:r>
+    </w:p>
+    <w:p>
+      <w:r>
+        <w:t>Cassandra looked highly skeptical. Quantum's own logistics desk wouldn't even authorize a flight path near the Skagit gorge in February.</w:t>
+      </w:r>
+    </w:p>
+    <w:p>
+      <w:r>
+        <w:t>"Call the 1-800 number on the back," Steve commanded gently. "Put it on speaker."</w:t>
+      </w:r>
+    </w:p>
+    <w:p>
+      <w:r>
+        <w:t>Cassandra frowned, picking up her office phone. She dialed the number and hit the speaker button. She braced her executive function for a labyrinthine Interactive Voice Response menu, preparing to press 1 for English and 3 for Account Services.</w:t>
+      </w:r>
+    </w:p>
+    <w:p>
+      <w:r>
+        <w:t>The line didn't even ring a full time.</w:t>
+      </w:r>
+    </w:p>
+    <w:p>
+      <w:r>
+        <w:t>"Good morning, Ms. Vance. Welcome to the Meridian Global Desk," a crisp, perfectly modulated human voice answered immediately. "It is an absolute pleasure to meet you."</w:t>
+      </w:r>
+    </w:p>
+    <w:p>
+      <w:r>
+        <w:t>Cassandra blinked, momentarily thrown off by the zero-friction connection. "Thank you."</w:t>
+      </w:r>
+    </w:p>
+    <w:p>
+      <w:r>
+        <w:t>"And I believe I hear Mr. Ballantine in the room," the concierge added smoothly. "Congratulations on the announcement this morning, Ms. Vance. We are thrilled to hear you have been tapped to lead Quantum."</w:t>
+      </w:r>
+    </w:p>
+    <w:p>
+      <w:r>
+        <w:t>"Thank you, William," Steve boomed warmly.</w:t>
+      </w:r>
+    </w:p>
+    <w:p>
+      <w:r>
+        <w:t>"However, Ms. Vance," the concierge continued, a note of gentle, highly trained concern entering his voice. "I am looking at your newly activated profile, and our algorithms have already flagged a high-risk anomaly. There are four identical, back-to-back charges for a municipal transit system in Oregon. I can overnight a replacement Obsidian Card to Building 33 immediately—"</w:t>
+      </w:r>
+    </w:p>
+    <w:p>
+      <w:r>
+        <w:t>Cassandra’s autonomic nervous system redlined instantly.</w:t>
+      </w:r>
+    </w:p>
+    <w:p>
+      <w:r>
+        <w:t xml:space="preserve">The sudden, unexpected friction—the implication of fraud, the immediate scrutiny on her perfectly calculated transit logistics—was a violent spike of sensory input. Her breathing hitched, her chest tightening as the threat of an account freeze loomed over her carefully planned weekend. </w:t>
+      </w:r>
+    </w:p>
+    <w:p>
+      <w:r>
+        <w:t xml:space="preserve">David was out of his chair in a microsecond. </w:t>
+      </w:r>
+    </w:p>
+    <w:p>
+      <w:r>
+        <w:t xml:space="preserve">He crossed the office, stepping directly behind her wheelchair. He didn't speak. He wrapped his arms securely over her shoulders and pulled her back against his chest, applying immediate, deep-pressure grounding. </w:t>
+      </w:r>
+    </w:p>
+    <w:p>
+      <w:r>
+        <w:t>Steve stepped in smoothly, seamlessly taking the verbal point to shield her.</w:t>
+      </w:r>
+    </w:p>
+    <w:p>
+      <w:r>
+        <w:t xml:space="preserve">"William, stand down," Steve instructed, his voice radiating calm executive authority. "Those are authorized purchases. Ms. Vance utilizes municipal transit exclusively; she does not use the corporate </w:t>
+      </w:r>
+      <w:proofErr w:type="spellStart"/>
+      <w:r>
+        <w:t>motorpool</w:t>
+      </w:r>
+      <w:proofErr w:type="spellEnd"/>
+      <w:r>
+        <w:t xml:space="preserve">. She is taking her family to Portland this weekend and was refilling their CTS RosePasses. The portal simply requires individual transactions, and she has four family members. No need to cancel the card." </w:t>
+      </w:r>
+    </w:p>
+    <w:p>
+      <w:r>
+        <w:t>"Understood entirely, Mr. Ballantine," the concierge pivoted flawlessly, zero judgment in his tone. "The security flag is cleared, Ms. Vance. Your RosePasses are fully funded. How else may I assist you today?"</w:t>
+      </w:r>
+    </w:p>
+    <w:p>
+      <w:r>
+        <w:t xml:space="preserve">The deep pressure from David did its job. Her heart rate, which had spiked wildly, began to decelerate back to a stable rhythm. She leaned her head back against her brother's arm, letting out a slow exhale, before leaning forward toward the speakerphone. </w:t>
+      </w:r>
+    </w:p>
+    <w:p>
+      <w:r>
+        <w:t>"I... I am trying to arrange logistics," Cassandra started nervously, her voice still slightly tight. "There is going to be a formal handover ceremony in February. I am trying to make arrangements for my family to come visit."</w:t>
+      </w:r>
+    </w:p>
+    <w:p>
+      <w:r>
+        <w:t>"We would be honored to arrange private aviation for your guests," the concierge offered warmly. "May I have the origin city?"</w:t>
+      </w:r>
+    </w:p>
+    <w:p>
+      <w:r>
+        <w:t xml:space="preserve">"That is the complication," Cassandra said, her hands resting tightly on her armrests. "My family lives on Ruby Mountain". </w:t>
+      </w:r>
+    </w:p>
+    <w:p>
+      <w:r>
+        <w:t>There was a brief pause on the line, followed by the sound of rapid, muted typing.</w:t>
+      </w:r>
+    </w:p>
+    <w:p>
+      <w:r>
+        <w:t xml:space="preserve">"The Prospector's Keep," the concierge confirmed, his tone shifting into one of profound professional respect. "I have had the privilege of managing logistics for clients staying at the Keep during the summer season. It is an honor to be speaking with a family member of Victoria Vance. However, as you are aware, Washington State Department of Transportation drops the barricades on SR-20 in the winter. The highway is closed". </w:t>
+      </w:r>
+    </w:p>
+    <w:p>
+      <w:r>
+        <w:t xml:space="preserve">Cassandra stalled. The reality of the thirty-foot walls of Cascades Concrete and the lethal avalanche zones paralyzed her logistical processor. </w:t>
+      </w:r>
+    </w:p>
+    <w:p>
+      <w:r>
+        <w:t>Steve leaned over, tapping the mahogany desk. "Ask for the helicopter, Cass," he whispered gently.</w:t>
+      </w:r>
+    </w:p>
+    <w:p>
+      <w:r>
+        <w:t>Cassandra swallowed hard. "I... I need to charter a helicopter. I need to get Victoria down the mountain to Redmond."</w:t>
+      </w:r>
+    </w:p>
+    <w:p>
+      <w:r>
+        <w:t>"That is absolutely possible, Ms. Vance," the concierge replied without a single ounce of hesitation.</w:t>
+      </w:r>
+    </w:p>
+    <w:p>
+      <w:r>
+        <w:t xml:space="preserve">Cassandra's breath hitched again, but this time in pure shock. "Wait. I want all seventeen family members of the Vance-Whitaker pack brought to Redmond". </w:t>
+      </w:r>
+    </w:p>
+    <w:p>
+      <w:r>
+        <w:t>"We will require two heavy, twin-engine commercial transport helicopters to accommodate the payload and the winter weather variables," the concierge calculated smoothly. "But yes. That is executable."</w:t>
+      </w:r>
+    </w:p>
+    <w:p>
+      <w:r>
+        <w:t xml:space="preserve">Cassandra’s mind spun. "But... Johnny. My cousin. He has complex medical needs". </w:t>
+      </w:r>
+    </w:p>
+    <w:p>
+      <w:r>
+        <w:t xml:space="preserve">"We are intimately familiar with the Keep's infrastructure," the concierge assured her. "We will ensure the transport is explicitly rated to manage his barometric transition, and we will secure all necessary FAA clearances for his portable </w:t>
+      </w:r>
+      <w:proofErr w:type="spellStart"/>
+      <w:r>
+        <w:t>RespiraCore</w:t>
+      </w:r>
+      <w:proofErr w:type="spellEnd"/>
+      <w:r>
+        <w:t xml:space="preserve"> Compressor. We can extract them directly from the elevated emergency helipad at the Keep, and land them directly on the executive helipad here on the Quantum campus". </w:t>
+      </w:r>
+    </w:p>
+    <w:p>
+      <w:r>
+        <w:t>Cassandra stared at the phone. She was completely, utterly speechless. She had spent the last week agonizing over the logistics, assuming she would have to work with Quantum's engineers to route a high-definition network feed directly to Morgan's server rack so Victoria and the pack could watch the ceremony remotely on a monitor.</w:t>
+      </w:r>
+    </w:p>
+    <w:p>
+      <w:r>
+        <w:t xml:space="preserve">Meridian wasn't offering a webcam. They were offering to pull her bloodline out of the sky. </w:t>
+      </w:r>
+    </w:p>
+    <w:p>
+      <w:r>
+        <w:t>"Yes," Steve boomed softly, a deeply satisfied smile on his face as he watched Cassandra process the sheer, unmitigated power of the shadow wallet. "They fix things."</w:t>
+      </w:r>
+    </w:p>
+    <w:p>
+      <w:r>
+        <w:t>"Please confirm the exact dates of the ceremony, Ms. Vance, and I will have the flight manifests drafted for your approval by the end of the business day," the concierge prompted.</w:t>
+      </w:r>
+    </w:p>
+    <w:p>
+      <w:r>
+        <w:t>Steve stepped in to finalize the details, smoothly wrapping up the call with the Meridian Global Desk, providing the exact February dates while Cassandra sat frozen in a state of absolute awe.</w:t>
+      </w:r>
+    </w:p>
+    <w:p>
+      <w:r>
+        <w:t>The line clicked dead.</w:t>
+      </w:r>
+    </w:p>
+    <w:p>
+      <w:r>
+        <w:t>Steve looked down at the thirty-five-year-old CEO-designate and her brother, who was still standing protectively behind her chair. Wall Street expected the new CEO to be mapping out the subterranean parking garage assignments. Instead, she had just secured the airspace over the North Cascades.</w:t>
+      </w:r>
+    </w:p>
+    <w:p>
+      <w:r>
+        <w:t xml:space="preserve">"Well," Steve smiled, checking his watch. "I believe you and David wanted to catch the bus to Bellevue to celebrate?" </w:t>
+      </w:r>
+    </w:p>
+    <w:p>
+      <w:pPr>
+        <w:pStyle w:val="Heading3"/>
+      </w:pPr>
+      <w:r>
+        <w:t>Part 7: The Actuarial Risk – 11:45 AM</w:t>
+      </w:r>
+    </w:p>
+    <w:p>
+      <w:r>
+        <w:t>The silence in the corner office was profound. Cassandra Vance stared at the silver-barreled fountain pen in her hand, the sheer, staggering reality of the Meridian Global Desk still settling into her highly analytical processor.</w:t>
+      </w:r>
+    </w:p>
+    <w:p>
+      <w:r>
+        <w:t xml:space="preserve">Before Steve Ballantine could finish his thought about their celebratory bus ride to Bellevue, the heavy glass doors to the executive suite swung open for the second time that morning. </w:t>
+      </w:r>
+    </w:p>
+    <w:p>
+      <w:r>
+        <w:t xml:space="preserve">Henderson, Quantum’s Head of Corporate Security, stepped into the room. He was accompanied by a man in a severe, tightly buttoned gray suit clutching a thick legal binder. </w:t>
+      </w:r>
+    </w:p>
+    <w:p>
+      <w:r>
+        <w:t xml:space="preserve">David Vance’s posture instantly stiffened. As Cassandra’s Licensed Practical Nurse and silent medical overwatch, he was highly attuned to the environmental energy of the room. He stepped slightly to the side of his sister's manual wheelchair, his eyes locking onto the new arrival with absolute, unyielding scrutiny. </w:t>
+      </w:r>
+    </w:p>
+    <w:p>
+      <w:r>
+        <w:t>"I apologize for the intrusion, Steve, Ms. Vance," Henderson said, his voice clipped and tight with professional stress. He gestured to the man beside him. "This is Sterling, our Chief Risk Officer. We have a critical blocker regarding the SEC transition filings."</w:t>
+      </w:r>
+    </w:p>
+    <w:p>
+      <w:r>
+        <w:t>Steve Ballantine crossed his arms, his booming, jovial energy vanishing instantly. "The board vote was unanimous, Sterling. What is the blocker?"</w:t>
+      </w:r>
+    </w:p>
+    <w:p>
+      <w:r>
+        <w:t>Sterling stepped forward, placing the heavy binder on the edge of Cassandra’s mahogany desk.</w:t>
+      </w:r>
+    </w:p>
+    <w:p>
+      <w:r>
+        <w:t>"It’s the Key Person Insurance policy, Mr. Ballantine," Sterling explained, sounding deeply apologetic but entirely panicked. "Under standard corporate governance, Quantum is legally required to hold a massive life and disability insurance policy on its Chief Executive Officer. I just got off the phone with the underwriters at Vanguard Global. They are flatly refusing to bind the policy."</w:t>
+      </w:r>
+    </w:p>
+    <w:p>
+      <w:r>
+        <w:t>Cassandra didn't look at the binder. She kept her eyes fixed on the Risk Officer. "On what grounds, Mr. Sterling?"</w:t>
+      </w:r>
+    </w:p>
+    <w:p>
+      <w:r>
+        <w:t xml:space="preserve">"Your transit profile, Ms. Vance," Sterling admitted, looking highly uncomfortable. "The underwriters ran a risk assessment. They noted your absolute refusal to utilize the armored executive </w:t>
+      </w:r>
+      <w:proofErr w:type="spellStart"/>
+      <w:r>
+        <w:t>motorpool</w:t>
+      </w:r>
+      <w:proofErr w:type="spellEnd"/>
+      <w:r>
+        <w:t>. They stated that allowing a trillion-dollar corporate asset to commute on the municipal King County TAPS bus system with the general public is an unacceptable, catastrophic liability."</w:t>
+      </w:r>
+    </w:p>
+    <w:p>
+      <w:r>
+        <w:t xml:space="preserve">Henderson sighed, rubbing the back of his neck. He had already lost this exact battle with Cassandra multiple times. "They are demanding a mandate in the contract, Ms. Vance. They want you in a secure, climate-controlled Apex Mountaineer with a dedicated security detail for all inter-office transit." </w:t>
+      </w:r>
+    </w:p>
+    <w:p>
+      <w:r>
+        <w:t>Cassandra looked at Steve. The outgoing CEO didn't look worried; he looked profoundly amused.</w:t>
+      </w:r>
+    </w:p>
+    <w:p>
+      <w:r>
+        <w:t>"I told the Board of Directors this was going to happen when I pitched the succession consensus," Steve chuckled, leaning against the glass wall. "I explicitly warned them that you legally cannot drive due to your medical baseline, and that you absolutely despise executive black cars. They knew exactly what your transit habits were when they cast their votes."</w:t>
+      </w:r>
+    </w:p>
+    <w:p>
+      <w:r>
+        <w:t>"The Board understands, Steve," Sterling pleaded, his hands hovering over the binder. "But the actuaries don't care about the Board's vote. They care about statistical risk. They view a public bus as an uncontrolled environment. If they refuse to bind the policy, we are out of compliance."</w:t>
+      </w:r>
+    </w:p>
+    <w:p>
+      <w:r>
+        <w:t>Cassandra unlocked the brakes on her wheelchair and rolled smoothly toward the center of the desk. The cold, impenetrable titanium armor of the CEO-designate slid flawlessly into place.</w:t>
+      </w:r>
+    </w:p>
+    <w:p>
+      <w:r>
+        <w:t>"Mr. Sterling," Cassandra stated, her voice dropping into a glacial, terrifyingly calm register. "Actuaries operate on mathematics. Let us look at the math."</w:t>
+      </w:r>
+    </w:p>
+    <w:p>
+      <w:r>
+        <w:t>She tapped her fingers across the mechanical keyboard of her docked Quantum laptop.</w:t>
+      </w:r>
+    </w:p>
+    <w:p>
+      <w:r>
+        <w:t>"An extended-wheelbase Apex Mountaineer weighs approximately three tons," Cassandra recited, her analytical mind pulling the raw vehicular data instantly. "If a distracted driver runs a red light on 156th Avenue NE and T-bones an Apex SUV at forty miles per hour, the kinetic transfer to the passenger cabin is severe. The risk of secondary concussive trauma is high."</w:t>
+      </w:r>
+    </w:p>
+    <w:p>
+      <w:r>
+        <w:t>She pulled up a secondary screen.</w:t>
+      </w:r>
+    </w:p>
+    <w:p>
+      <w:r>
+        <w:t xml:space="preserve">"A heavy, articulated TAPS King County bus weighs over fifteen tons," Cassandra continued smoothly. "If that same vehicle strikes the side of my bus, the kinetic energy is almost entirely absorbed by the industrial chassis. The bus wins the physics equation every single time." </w:t>
+      </w:r>
+    </w:p>
+    <w:p>
+      <w:r>
+        <w:t>Sterling opened his mouth to counter, but Cassandra held up a single, manicured finger, cutting him off completely.</w:t>
+      </w:r>
+    </w:p>
+    <w:p>
+      <w:r>
+        <w:t xml:space="preserve">"Furthermore, we must address the medical friction," Cassandra added, glancing briefly at David. "To utilize an armored SUV, I am forced to physically transfer out of my custom manual wheelchair, haul myself into a passenger seat, and surrender my primary mobility equipment to a trunk like a piece of luggage. It breaks my physical autonomy. A TAPS bus utilizes a mechanical ramp and level boarding. I roll into the designated ADA bay, lock my brakes, and remain entirely self-sufficient." </w:t>
+      </w:r>
+    </w:p>
+    <w:p>
+      <w:r>
+        <w:t>She locked her dark eyes onto the Chief Risk Officer.</w:t>
+      </w:r>
+    </w:p>
+    <w:p>
+      <w:r>
+        <w:t>"I do not ride the municipal grid to make a philosophical statement, Mr. Sterling. I ride it because it is the safest, most efficient, and most medically accessible transit architecture available to me."</w:t>
+      </w:r>
+    </w:p>
+    <w:p>
+      <w:r>
+        <w:t>"I understand the logic, Ms. Vance," Sterling stammered, sweating slightly under her intense gaze. "But the underwriters—"</w:t>
+      </w:r>
+    </w:p>
+    <w:p>
+      <w:r>
+        <w:t>"The underwriters work for us," Cassandra interrupted, delivering the absolute, lethal finality of her new position. "Quantum Corporation pays Vanguard Global hundreds of millions of dollars in annual premiums for our global enterprise liability coverage. You are going to walk back to your office, Mr. Sterling, and you are going to call them back."</w:t>
+      </w:r>
+    </w:p>
+    <w:p>
+      <w:r>
+        <w:t>Cassandra leaned forward, resting her arms on her wheelchair.</w:t>
+      </w:r>
+    </w:p>
+    <w:p>
+      <w:r>
+        <w:t xml:space="preserve">"You will inform them that if they do not bind my Key Person policy exactly as it stands—inclusive of my blue TAPS pass—I will personally instruct our treasury department to sever Quantum's entire global portfolio and hand the contracts to their fiercest competitor before the market closes today." </w:t>
+      </w:r>
+    </w:p>
+    <w:p>
+      <w:r>
+        <w:t xml:space="preserve">Absolute financial force is the universal solvent for operational friction. </w:t>
+      </w:r>
+    </w:p>
+    <w:p>
+      <w:r>
+        <w:t>Sterling stared at her. The sheer, overwhelming weight of the threat completely crushed any further argument. He wasn't dealing with a fragile executive; he was dealing with an apex predator who knew exactly how much leverage she held.</w:t>
+      </w:r>
+    </w:p>
+    <w:p>
+      <w:r>
+        <w:t>"I... I will make the call immediately, Ms. Vance," Sterling swallowed hard, snatching the binder off the desk. "I am certain they will find a way to accommodate the policy."</w:t>
+      </w:r>
+    </w:p>
+    <w:p>
+      <w:r>
+        <w:t>"I am certain they will," Cassandra agreed politely. "Have a good morning, gentlemen."</w:t>
+      </w:r>
+    </w:p>
+    <w:p>
+      <w:r>
+        <w:t>Henderson offered a deeply respectful, deferential nod before ushering the panicked Risk Officer out of the suite.</w:t>
+      </w:r>
+    </w:p>
+    <w:p>
+      <w:r>
+        <w:t>The heavy glass doors clicked shut.</w:t>
+      </w:r>
+    </w:p>
+    <w:p>
+      <w:r>
+        <w:t xml:space="preserve">David let out a quiet, raspy exhale of amusement, picking up his LPN tablet. "Well, you certainly gave the actuaries something to hyperventilate about." </w:t>
+      </w:r>
+    </w:p>
+    <w:p>
+      <w:r>
+        <w:t xml:space="preserve">"Actuaries hate anomalies," Cassandra replied, slipping the black titanium Obsidian Card into the inner pocket of her tailored blazer. She checked her watch. "It is 11:55 AM. I have twenty minutes before my scheduled departure. Are we still taking the Route 230 to Bellevue?" </w:t>
+      </w:r>
+    </w:p>
+    <w:p>
+      <w:r>
+        <w:t>Steve Ballantine pushed off the glass wall, a massive, triumphant grin spreading across his face.</w:t>
+      </w:r>
+    </w:p>
+    <w:p>
+      <w:r>
+        <w:t>"Absolutely," Steve boomed, adjusting his tie. "I wouldn't miss it for the world."</w:t>
+      </w:r>
+    </w:p>
+    <w:p>
+      <w:pPr>
+        <w:pStyle w:val="Heading3"/>
+      </w:pPr>
+      <w:r>
+        <w:t xml:space="preserve">Part </w:t>
+      </w:r>
+      <w:r>
+        <w:t>8</w:t>
+      </w:r>
+      <w:r>
+        <w:t>: The Route 230 Protocol – 12:15 PM</w:t>
+      </w:r>
+    </w:p>
+    <w:p>
+      <w:r>
+        <w:t>By noon, the Redmond campus was buzzing with an electric, celebratory energy. The global email had deployed, and the "Courtyard CEO" was officially the successor.</w:t>
+      </w:r>
+    </w:p>
+    <w:p>
+      <w:r>
+        <w:t>Inside the Building 33 executive suite, the Head of Corporate Security, a man named Henderson, was actively trying to execute his newly assigned mandate. He trailed closely behind Cassandra as she wheeled out of her corner office, flanked by two highly stressed executive fixers.</w:t>
+      </w:r>
+    </w:p>
+    <w:p>
+      <w:r>
+        <w:t>"Ms. Vance, the press pool has completely surrounded the main visitor entrance," Henderson warned, checking his earpiece. "I have two armored SUVs waiting in the subterranean executive garage. We can slip you out under the radar. Your house is only three blocks away; we can have you home and secure in under two minutes."</w:t>
+      </w:r>
+    </w:p>
+    <w:p>
+      <w:r>
+        <w:t>"I am not sneaking out of my own building in an armored tank, Henderson," Cassandra replied smoothly, her Quantum laptop bag resting securely on her lap. "Besides, I'm not going home just yet. And officially, I am not the CEO until Steve retires on February 14th. Today, I am just celebrating."</w:t>
+      </w:r>
+    </w:p>
+    <w:p>
+      <w:r>
+        <w:t>"Then let us drive you to your celebration!" one of the fixers pleaded, stepping in front of her chair. "Where are you going? Bellevue? We can have the motorcade spool up—"</w:t>
+      </w:r>
+    </w:p>
+    <w:p>
+      <w:r>
+        <w:t>"I already told the dispatch to stand down," Cassandra interrupted politely but firmly, wheeling smoothly around him. "Good afternoon, gentlemen. I am taking the bus."</w:t>
+      </w:r>
+    </w:p>
+    <w:p>
+      <w:r>
+        <w:t>She left the horrified security director and the fixers standing speechless in the executive corridor.</w:t>
+      </w:r>
+    </w:p>
+    <w:p>
+      <w:r>
+        <w:t>Leaving Building 33, Cassandra could have easily taken the short, paved roll back to her sprawling Redmond property to celebrate with David, Liz, and Casey. But today, she had a specific errand in mind.</w:t>
+      </w:r>
+    </w:p>
+    <w:p>
+      <w:r>
+        <w:t>She wheeled herself across the crisp, sunlit campus, navigating the wide sidewalks toward Building 16. The moment she entered the building's massive cafeteria to grab a quick bite to eat, a spontaneous round of applause broke out among the developers and staff eating their lunches. Cassandra smiled, waving and stopping to shake a few hands, picking up a standard deli sandwich and a sparkling water before continuing her trek.</w:t>
+      </w:r>
+    </w:p>
+    <w:p>
+      <w:r>
+        <w:t>She rolled through the campus pathways, enjoying the crisp winter air, until she emerged on the eastern edge of the campus near Building 25.</w:t>
+      </w:r>
+    </w:p>
+    <w:p>
+      <w:r>
+        <w:t>She rolled right up to the curb of 156th Avenue NE and locked her brakes at the municipal transit shelter.</w:t>
+      </w:r>
+    </w:p>
+    <w:p>
+      <w:r>
+        <w:t>A breathless fixer, who had apparently jogged all the way across campus from Building 33, came huffing up to the bus stop. "Ms. Vance! Please! If you absolutely insist on taking public transit to the Downtown Bellevue offices, at least let me walk you up to the Overlake Transit Center so you can catch the TAPS Express 564 or 565!"</w:t>
+      </w:r>
+    </w:p>
+    <w:p>
+      <w:r>
+        <w:t>Cassandra took a bite of her sandwich, looking at the exhausted handler with a mixture of amusement and pity.</w:t>
+      </w:r>
+    </w:p>
+    <w:p>
+      <w:r>
+        <w:t>"I don't want the express route today," Cassandra explained calmly. "I want to see the neighborhood."</w:t>
+      </w:r>
+    </w:p>
+    <w:p>
+      <w:r>
+        <w:t>"But the local route takes forever!" the fixer groaned, looking at the schedule posted on the glass shelter.</w:t>
+      </w:r>
+    </w:p>
+    <w:p>
+      <w:r>
+        <w:t>"Which gives me plenty of time to eat my lunch," Cassandra smiled.</w:t>
+      </w:r>
+    </w:p>
+    <w:p>
+      <w:r>
+        <w:t>A few minutes later, the heavy, articulated TAPS King County Route 230 bus hissed to a halt at the curb. The doors opened, and the driver immediately hit the switch to lower the mechanical ramp.</w:t>
+      </w:r>
+    </w:p>
+    <w:p>
+      <w:r>
+        <w:t>"Afternoon, Cassandra!" the driver called out cheerfully, entirely accustomed to the nice lady in the wheelchair who knew the transit grid better than the dispatchers. "Heard the good news on the radio! Congratulations!"</w:t>
+      </w:r>
+    </w:p>
+    <w:p>
+      <w:r>
+        <w:t>"Thank you, Marcus," Cassandra smiled warmly, rolling up the incline.</w:t>
+      </w:r>
+    </w:p>
+    <w:p>
+      <w:r>
+        <w:t>She tapped her blue TAPS Pass against the digital reader, leaving the bewildered corporate handler standing on the sidewalk. She maneuvered her manual chair into the designated ADA bay, locked her brakes, and watched out the window as the 230 began its route.</w:t>
+      </w:r>
+    </w:p>
+    <w:p>
+      <w:r>
+        <w:t>It was the ultimate, defiant contrast to the Silicon Valley billionaire stereotype. The entire financial world was currently obsessing over her historic ascension, and her very first executive decision as the CEO-designate was to take the local bus.</w:t>
+      </w:r>
+    </w:p>
+    <w:p>
+      <w:r>
+        <w:t>The Route 230 crawled down 156th Avenue NE, offering her a slow, nostalgic view of the sprawling Redmond suburbs before it finally signaled its right turn onto NE 8th Street. As the bus carried her straight into the towering, glass-and-steel heart of Downtown Bellevue, Cassandra felt a profound sense of closure.</w:t>
+      </w:r>
+    </w:p>
+    <w:p>
+      <w:r>
+        <w:t>When the bus finally dropped her off at the Bellevue Transit Center, she didn't head toward a high-end restaurant or a press junket. She wheeled herself toward the older Quantum office towers. She was going to see the original mid-level managers and legacy developers who had given a nineteen-year-old disabled girl her very first shot in the summer of 2000.</w:t>
+      </w:r>
+    </w:p>
+    <w:p>
+      <w:r>
+        <w:t>She was about to run the empire, but she was never going to forget the people who helped her build the foundation.</w:t>
+      </w:r>
+    </w:p>
+    <w:p>
+      <w:pPr>
+        <w:pStyle w:val="Heading3"/>
+      </w:pPr>
+      <w:r>
+        <w:t xml:space="preserve">Part </w:t>
+      </w:r>
+      <w:r>
+        <w:t>9</w:t>
+      </w:r>
+      <w:r>
+        <w:t>: The Bellevue Reunion – 1:30 PM</w:t>
+      </w:r>
+    </w:p>
+    <w:p>
+      <w:r>
+        <w:t>When Cassandra Vance rolled into the twelfth-floor bullpen of Quantum's Downtown Bellevue tower, flanked closely by her brother David, the entire floor came to a complete, stunned halt.</w:t>
+      </w:r>
+    </w:p>
+    <w:p>
+      <w:r>
+        <w:t>The legacy managers and veteran senior developers—the exact same people who had taken a chance on a nineteen-year-old disabled girl fresh out of physical rehab back in the summer of 2000—stared at her in absolute disbelief. They had all read the global email broadcast that morning. They knew that she had just been unanimously tapped to inherit the trillion-dollar tech empire. They simply couldn't believe that instead of celebrating with Wall Street elites or popping champagne in the Building 33 vault, she had taken a local city bus to come see them.</w:t>
+      </w:r>
+    </w:p>
+    <w:p>
+      <w:r>
+        <w:t>"You really did it, Cass," an older, gray-haired database architect laughed, walking over to wrap her in a warm, familiar hug. "They actually gave you the keys to the machine."</w:t>
+      </w:r>
+    </w:p>
+    <w:p>
+      <w:r>
+        <w:t>"I only know how the machine works because you all taught me how to read the blueprints," Cassandra smiled warmly, returning the embrace.</w:t>
+      </w:r>
+    </w:p>
+    <w:p>
+      <w:r>
+        <w:t>For the next twenty minutes, the bullpen was a chorus of joyous celebration. Cassandra shook hands, caught up on old deployment war stories, and genuinely basked in the unvarnished affection of the people who had formed her original corporate perimeter.</w:t>
+      </w:r>
+    </w:p>
+    <w:p>
+      <w:r>
+        <w:t xml:space="preserve">David Vance didn't join the handshakes. Operating in his role as a silent medical overwatch, he set himself up at a small, empty desk in the corner of the bullpen, keeping a direct line of sight to his sister while monitoring the continuous Mobile Cardiac Telemetry (MCT) Holter data streaming to his LPN tablet. </w:t>
+      </w:r>
+    </w:p>
+    <w:p>
+      <w:r>
+        <w:t>But true to her nature, Cassandra Vance never stayed entirely off the clock for long.</w:t>
+      </w:r>
+    </w:p>
+    <w:p>
+      <w:r>
+        <w:t>When the initial wave of congratulations naturally settled, Cassandra didn't head back to the elevators. Instead, she navigated her manual chair toward the open-plan communal workspace overlooking the Bellevue skyline. With a quick mechanical snap, her piano-black Quantum laptop locked into the specialized, commercial-grade articulated mounting arm outfitted on her chair.</w:t>
+      </w:r>
+    </w:p>
+    <w:p>
+      <w:r>
+        <w:t>She noticed a cluster of new, entry-level junior developers hovering nervously near the breakroom. They were clutching their laptops, staring at her with wide eyes. To them, she wasn't the nostalgic kid from the year 2000; she was the newly minted CEO-designate of the most powerful software corporation on earth.</w:t>
+      </w:r>
+    </w:p>
+    <w:p>
+      <w:r>
+        <w:t>Cassandra offered them a sharp, welcoming smile and patted the empty communal table next to her chair.</w:t>
+      </w:r>
+    </w:p>
+    <w:p>
+      <w:r>
+        <w:t>"Don't just stand there analyzing the optics," Cassandra called out, her voice projecting a smooth, pragmatic ease. "Grab a seat. Let's look at what you're working on."</w:t>
+      </w:r>
+    </w:p>
+    <w:p>
+      <w:r>
+        <w:t>The junior developers hesitantly shuffled over, pulling out chairs. As they sat down, Cassandra decided to explicitly establish the operational baseline for her new era of leadership. She reached into her laptop bag and pulled out a pair of heavy, noise-canceling headphones, resting them flat on the table.</w:t>
+      </w:r>
+    </w:p>
+    <w:p>
+      <w:r>
+        <w:t xml:space="preserve">"Let's establish the ground rules right now," Cassandra announced, ensuring her voice carried across the communal space. "When you see me set up in a workspace, the protocol is simple. If these heavy headphones are over my ears, I am tearing apart a deployment schedule or running an executive audit, and I cannot be interrupted. But if my headphones are resting on the table—like they are right now—the perimeter is entirely open. You do not need an appointment, you do not need an executive assistant, and you do not need to be a manager to speak to me." </w:t>
+      </w:r>
+    </w:p>
+    <w:p>
+      <w:r>
+        <w:t>She looked around the table at the young, intimidated faces, completely dropping the veil of corporate omniscience.</w:t>
+      </w:r>
+    </w:p>
+    <w:p>
+      <w:r>
+        <w:t>"I am officially taking over this company next month, but I am only in my thirties," Cassandra explained, leaning forward on her armrests. "My foundational coding habits were built a decade ago. Technology moves significantly faster than the C-suite. You are the ones actively learning the newest frameworks and the bleeding-edge syntax in your university labs. I know how this machine currently runs, but I want to know how it should run."</w:t>
       </w:r>
     </w:p>
     <w:p>
@@ -6097,7 +6735,74 @@
     </w:p>
     <w:p>
       <w:r>
-        <w:t xml:space="preserve">For the next hour, the billionaire CEO-designate of Quantum Corporation sat in the middle of a bustling Bellevue office, not holding a press conference or counting her stock options, but actively side-by-side coding with her newest employees, proving to the entire company that the "learn-it-all" era had officially begun. </w:t>
+        <w:t>For the next half hour, the billionaire CEO-designate of Quantum Corporation sat in the middle of a bustling Bellevue office, not holding a press conference or counting her stock options, but actively side-by-side coding with her newest employees, proving to the entire company that the "learn-it-all" era had officially begun.</w:t>
+      </w:r>
+    </w:p>
+    <w:p>
+      <w:r>
+        <w:t>But at exactly 2:00 PM, the frictionless coding session was abruptly interrupted.</w:t>
+      </w:r>
+    </w:p>
+    <w:p>
+      <w:r>
+        <w:t>David Vance stood up from his corner desk, his LPN tablet in hand. He walked directly up to the communal table, bypassing a pair of senior managers without a second glance. To the young developer currently explaining her routing protocol, David was a completely jarring anomaly—a man wearing the bright Orange Badge of a low-level contractor who had just effortlessly stepped into the personal airspace of the CEO</w:t>
+      </w:r>
+      <w:r>
+        <w:t>-designate</w:t>
+      </w:r>
+      <w:r>
+        <w:t xml:space="preserve">. </w:t>
+      </w:r>
+    </w:p>
+    <w:p>
+      <w:r>
+        <w:t>The young developer's voice faltered, her fingers freezing on her keyboard as David stepped directly beside Cassandra’s wheelchair.</w:t>
+      </w:r>
+    </w:p>
+    <w:p>
+      <w:r>
+        <w:t xml:space="preserve">David didn't say a word. He was executing the 14:00 Afternoon Autonomic Check. He initiated a non-verbal assessment, reading the micro-expressions around Cassandra's eyes to gauge her AuDHD masking fatigue after the high-stakes morning she had just navigated. He reached out, gently slipping a small pulse oximeter onto her index finger to log her SpO2. </w:t>
+      </w:r>
+    </w:p>
+    <w:p>
+      <w:r>
+        <w:t>Cassandra didn't stop looking at the young developer's code. She didn't break her executive focus. She simply turned her left palm upward in a familiar, deeply ingrained motion.</w:t>
+      </w:r>
+    </w:p>
+    <w:p>
+      <w:r>
+        <w:t xml:space="preserve">David checked his tablet, verifying her Holter EKG rhythm against the transit vibrations they had endured on the Route 230 bus. Satisfied with the telemetry, he pulled a small pill bottle from his leather medical kit. He dropped a single oral dose of Baclofen—a localized muscle relaxant—into her palm, handing her a bottle of water. </w:t>
+      </w:r>
+    </w:p>
+    <w:p>
+      <w:r>
+        <w:t xml:space="preserve">The medication was a strict biological necessity. Because of her Complex Regional Pain Syndrome, the daily transit vibrations and physical exhaustion triggered disrupted nerve signals. The Baclofen prevented the muscles in her lower legs and feet from violently spasming or cramping against the footrests of her wheelchair. </w:t>
+      </w:r>
+    </w:p>
+    <w:p>
+      <w:r>
+        <w:t>Cassandra swallowed the pill, handed the water bottle back, and pointed at line 42 on the developer's screen. "You have a null reference exception forming right there," she noted smoothly, entirely ignoring the medical intervention.</w:t>
+      </w:r>
+    </w:p>
+    <w:p>
+      <w:r>
+        <w:t xml:space="preserve">The rookie developer stared at David as he quietly unclipped the pulse oximeter, logged the visual and auditory sensory assessment into his MAR, and turned to leave. She looked terrified, unsure if she was supposed to pause her presentation for the contractor. </w:t>
+      </w:r>
+    </w:p>
+    <w:p>
+      <w:r>
+        <w:t>From the next desk over, the older, gray-haired database architect caught the rookie's wide-eyed panic. He offered a warm, reassuring smile and gave her a subtle wave to continue.</w:t>
+      </w:r>
+    </w:p>
+    <w:p>
+      <w:r>
+        <w:t>"Keep coding, kid," the veteran architect whispered fondly, entirely accustomed to the sibling dynamic that had governed Cassandra's baseline since the year 200</w:t>
+      </w:r>
+      <w:r>
+        <w:t>5</w:t>
+      </w:r>
+      <w:r>
+        <w:t>. "He's just doing his job."</w:t>
       </w:r>
     </w:p>
     <w:p>
@@ -6105,7 +6810,13 @@
         <w:pStyle w:val="Heading3"/>
       </w:pPr>
       <w:r>
-        <w:t>Part 7: The Express Route – 5:15 PM</w:t>
+        <w:t xml:space="preserve">Part </w:t>
+      </w:r>
+      <w:r>
+        <w:t>10</w:t>
+      </w:r>
+      <w:r>
+        <w:t>: The Express Route – 5:15 PM</w:t>
       </w:r>
     </w:p>
     <w:p>
@@ -6193,7 +6904,13 @@
         <w:pStyle w:val="Heading3"/>
       </w:pPr>
       <w:r>
-        <w:t>Part 8: The Sovereign Perimeter – 6:15 PM</w:t>
+        <w:t xml:space="preserve">Part </w:t>
+      </w:r>
+      <w:r>
+        <w:t>11</w:t>
+      </w:r>
+      <w:r>
+        <w:t>: The Sovereign Perimeter – 6:15 PM</w:t>
       </w:r>
     </w:p>
     <w:p>
@@ -6208,7 +6925,7 @@
     </w:p>
     <w:p>
       <w:r>
-        <w:t xml:space="preserve">Her destination was the sprawling, single-story Pacific Northwest rambler she had ruthlessly acquired for $1.5 million in cash a decade ago. It had been gutted to the studs to feature commercial-grade ADA accessibility and enterprise-level Quantum networking, but tonight, it was simply home. </w:t>
+        <w:t>Her destination was the sprawling, single-story Pacific Northwest rambler she had ruthlessly acquired for $1.5 million in cash a decade ago. It had been gutted to the studs to feature commercial-grade ADA accessibility and enterprise-level Quantum networking, but tonight, it was simply home.</w:t>
       </w:r>
     </w:p>
     <w:p>
@@ -6263,7 +6980,7 @@
     </w:p>
     <w:p>
       <w:r>
-        <w:t xml:space="preserve">Ten years ago, David had been isolated in a Portsmouth apartment with an abusive, manipulative girlfriend named Kristine. On Thanksgiving morning, Kristine had casually informed the visiting Vance pack that because she was lactose intolerant, there was no milk in the house, forcing David and his sisters to eat bowls of completely dry cereal while she asserted her territorial dominance. It was the exact morning Cassandra had ruthlessly intervened, pulling the plug on the toxic environment and extracting her brother. </w:t>
+        <w:t>Ten years ago, David had been isolated in a Portsmouth apartment with an abusive, manipulative girlfriend named Kristine. On Thanksgiving morning, Kristine had casually informed the visiting Vance pack that because she was lactose intolerant, there was no milk in the house, forcing David and his sisters to eat bowls of completely dry cereal while she asserted her territorial dominance. It was the exact morning Cassandra had ruthlessly intervened, pulling the plug on the toxic environment and extracting her brother.</w:t>
       </w:r>
     </w:p>
     <w:p>
@@ -6283,12 +7000,86 @@
     </w:p>
     <w:p>
       <w:r>
+        <w:t xml:space="preserve">At 8:00 PM, the casual atmosphere shifted seamlessly into David's mandatory Evening Wind-Down. The protocol was designed specifically for transitioning Cassandra's AuDHD brain from "CEO mode" to "sleep mode" while actively mitigating nighttime neuropathic pain spikes. </w:t>
+      </w:r>
+    </w:p>
+    <w:p>
+      <w:r>
+        <w:t xml:space="preserve">David pulled out his LPN tablet, initiating the system shut-down. He quietly logged her final Blood Pressure and Heart Rate, and asked for her current Neuropathic pain scale on a 1-10 level. </w:t>
+      </w:r>
+    </w:p>
+    <w:p>
+      <w:r>
+        <w:t xml:space="preserve">Satisfied with the numbers, he handed her the nightly medications. The first was Guanfacine, an alpha-2 agonist meant to lower her blood pressure, treat ADHD rejection sensitive dysphoria (RSD), and effectively "turn off" her racing thoughts so her executive function could power down. The second was Gabapentin, a secondary nerve-blocker necessary to ensure the permanent internal scarring in her feet didn't wake her up with phantom impact pain. </w:t>
+      </w:r>
+    </w:p>
+    <w:p>
+      <w:r>
+        <w:t xml:space="preserve">Once the medication was administered, David initiated the overnight Holter baseline setup. Because Vanguard Global's Key Person Insurance policy mandated continuous, uninterrupted operation of Cassandra’s Mobile Cardiac Telemetry (MCT) Holter monitor, David could not simply disconnect the device. He opened the secure medical portal on his LPN tablet. He sent a direct, coded ping to the Building 33 nurses on 24/7 duty monitoring the incoming server feed: </w:t>
+      </w:r>
+      <w:r>
+        <w:rPr>
+          <w:i/>
+          <w:iCs/>
+        </w:rPr>
+        <w:t>VANCE_MCT Offline: Scheduled Hardware Maintenance - Battery Swap</w:t>
+      </w:r>
+      <w:r>
+        <w:t xml:space="preserve">. </w:t>
+      </w:r>
+    </w:p>
+    <w:p>
+      <w:r>
+        <w:t xml:space="preserve">A few seconds later, the legal handshake returned from the occupational health desk. </w:t>
+      </w:r>
+      <w:r>
+        <w:rPr>
+          <w:i/>
+          <w:iCs/>
+        </w:rPr>
+        <w:t>Log Confirmed. Vanguard Timer Initiated.</w:t>
+      </w:r>
+    </w:p>
+    <w:p>
+      <w:r>
+        <w:t>With the fifteen-minute grace period officially active, David moved with the speed and precision of a pit crew. He carefully unclipped the depleted battery from her continuous Mobile Cardiac Telemetry (MCT) Holter monitor, placing it onto the charging base, and instantly slid a fresh battery into the unit.</w:t>
+      </w:r>
+    </w:p>
+    <w:p>
+      <w:r>
+        <w:t xml:space="preserve">Within seconds, his tablet caught the Bluetooth handshake. The device re-established its connection, streaming her real-time EKG data straight to his screen. Once he visually confirmed her heart rate was stable, David pinged the nurses again: </w:t>
+      </w:r>
+      <w:r>
+        <w:rPr>
+          <w:i/>
+          <w:iCs/>
+        </w:rPr>
+        <w:t>VANCE_MCT Online. Baseline Stable</w:t>
+      </w:r>
+      <w:r>
+        <w:t xml:space="preserve">. </w:t>
+      </w:r>
+    </w:p>
+    <w:p>
+      <w:r>
+        <w:t xml:space="preserve">Almost instantly, the nurses at Quantum Corporate replied: </w:t>
+      </w:r>
+      <w:r>
+        <w:rPr>
+          <w:i/>
+          <w:iCs/>
+        </w:rPr>
+        <w:t>Confirmed. Telemetry receiving. Readouts are normal.</w:t>
+      </w:r>
+    </w:p>
+    <w:p>
+      <w:r>
         <w:t>By 9:00 PM, the celebration naturally wound down. The physical toll of the day was heavy, and tomorrow, the real work of transitioning from Executive Vice President of Operations to President and Chief Executive Officer of Quantum would officially begin.</w:t>
       </w:r>
     </w:p>
     <w:p>
       <w:r>
-        <w:t>The four of them completed their evening routines and filed into the master suite, piling onto the massive Alaska King mattress. Surrounded by the steady, deep-pressure weight of her family, Cassandra closed her eyes, perfectly anchored, and drifted off to sleep.</w:t>
+        <w:t>The four of them completed their evening routines and filed into the master suite, piling onto the massive Alaska King mattress. Surrounded by the steady, deep-pressure weight of her family, Cassandra closed her eyes, perfectly anchored, and drifted off to sleep</w:t>
       </w:r>
     </w:p>
     <w:p>
@@ -7390,7 +8181,7 @@
     </w:p>
     <w:p>
       <w:r>
-        <w:t>"I just don't understand the optics of this," Peter grumbled, pulling his coat tighter around his shoulders and glaring at the glowing digital arrival sign. "Your stepdaughter was just named the Chief Executive Officer of the most powerful technology company on the planet. And we are standing on wet concrete waiting for a public city bus."</w:t>
+        <w:t>"I just don't understand the optics of this," Peter grumbled, pulling his coat tighter around his shoulders and glaring at the glowing digital arrival sign. "Your daughter was just named the Chief Executive Officer of the most powerful technology company on the planet. And we are standing on wet concrete waiting for a public city bus."</w:t>
       </w:r>
     </w:p>
     <w:p>
@@ -8705,7 +9496,13 @@
     </w:p>
     <w:p>
       <w:r>
-        <w:t>"Yes, Greg. The Fenwick Bridge," Cassandra replied, adjusting her glasses as the silver Capital Transit train glided smoothly onto the platform above. "Select your fare and tap quickly. If you hurry, you'll only be fifteen minutes late to my opening statement. See you on Capitol Hill."</w:t>
+        <w:t xml:space="preserve">"Yes, Greg. The </w:t>
+      </w:r>
+      <w:r>
+        <w:t xml:space="preserve">Charles R. </w:t>
+      </w:r>
+      <w:r>
+        <w:t>Fenwick Bridge," Cassandra replied, adjusting her glasses as the silver Capital Transit train glided smoothly onto the platform above. "Select your fare and tap quickly. If you hurry, you'll only be fifteen minutes late to my opening statement. See you on Capitol Hill."</w:t>
       </w:r>
     </w:p>
     <w:p>

</xml_diff>